<commit_message>
Release v1.0.1: fix sandbox currency and Cook Islands billing
</commit_message>
<xml_diff>
--- a/docs/Merchant Setup Guide.docx
+++ b/docs/Merchant Setup Guide.docx
@@ -796,28 +796,7 @@
         </w:numPr>
       </w:pPr>
       <w:r>
-        <w:rPr>
-          <w:rFonts w:ascii="Arial" w:hAnsi="Arial"/>
-          <w:b w:val="0"/>
-          <w:sz w:val="24"/>
-        </w:rPr>
-        <w:t xml:space="preserve">Keep </w:t>
-      </w:r>
-      <w:r>
-        <w:rPr>
-          <w:rFonts w:ascii="Arial" w:hAnsi="Arial"/>
-          <w:b/>
-          <w:sz w:val="24"/>
-        </w:rPr>
-        <w:t>Test mode</w:t>
-      </w:r>
-      <w:r>
-        <w:rPr>
-          <w:rFonts w:ascii="Arial" w:hAnsi="Arial"/>
-          <w:b w:val="0"/>
-          <w:sz w:val="24"/>
-        </w:rPr>
-        <w:t xml:space="preserve"> enabled while testing with sandbox credentials. Disable it only after configuring live credentials and confirming that you are ready to receive live payments.</w:t>
+        <w:t>Keep Use sandbox credentials and endpoint enabled while testing. The BPC development environment defaults to EUR, so leave Sandbox Currency set to EUR. If the development merchant currency is changed in the BPC Dev Merchant Portal, select the same currency in WooCommerce. A mismatch can cause Error 3: Unknown currency. Disable sandbox mode only after configuring live credentials and confirming that you are ready to receive live payments.</w:t>
       </w:r>
     </w:p>
     <w:p>
@@ -1114,11 +1093,7 @@
         </w:numPr>
       </w:pPr>
       <w:r>
-        <w:rPr>
-          <w:rFonts w:ascii="Arial" w:hAnsi="Arial"/>
-          <w:sz w:val="22"/>
-        </w:rPr>
-        <w:t>Disable Test mode only when you are ready to process real payments.</w:t>
+        <w:t>Disable Use sandbox credentials and endpoint only when you are ready to process real payments. Live payment requests use NZD.</w:t>
       </w:r>
     </w:p>
     <w:p>

</xml_diff>